<commit_message>
Add illustrated Primary 1 Week 1 lesson note (Getting to Know Technology)
</commit_message>
<xml_diff>
--- a/downloads/Rehoteq_Lesson_Note_P1_T1_W1_Getting_to_Know_Technology.docx
+++ b/downloads/Rehoteq_Lesson_Note_P1_T1_W1_Getting_to_Know_Technology.docx
@@ -972,7 +972,235 @@
         <w:pStyle w:val="Heading1"/>
       </w:pPr>
       <w:r>
-        <w:t>5. Period One: Introduce and Model</w:t>
+        <w:t>5. Sample Pictures</w:t>
+      </w:r>
+    </w:p>
+    <w:p>
+      <w:pPr>
+        <w:spacing w:after="120"/>
+      </w:pPr>
+      <w:r>
+        <w:rPr>
+          <w:b w:val="0"/>
+          <w:i w:val="0"/>
+        </w:rPr>
+        <w:t>The illustrations below are original Rehoteq sample pictures for this lesson. Each carries a text caption, and important information does not depend on colour alone. Teachers may also draw these objects on the chalkboard or bring the real objects to class.</w:t>
+      </w:r>
+    </w:p>
+    <w:p>
+      <w:pPr>
+        <w:jc w:val="center"/>
+      </w:pPr>
+      <w:r>
+        <w:drawing>
+          <wp:inline xmlns:a="http://schemas.openxmlformats.org/drawingml/2006/main" xmlns:pic="http://schemas.openxmlformats.org/drawingml/2006/picture">
+            <wp:extent cx="4680000" cy="3120000" descr="A Nigerian teacher holds up a spoon and a cup while pupils sit and watch; a broom, a radio and a feature phone rest on the table."/>
+            <wp:docPr id="1" name="Picture 1"/>
+            <wp:cNvGraphicFramePr>
+              <a:graphicFrameLocks noChangeAspect="1"/>
+            </wp:cNvGraphicFramePr>
+            <a:graphic>
+              <a:graphicData uri="http://schemas.openxmlformats.org/drawingml/2006/picture">
+                <pic:pic>
+                  <pic:nvPicPr>
+                    <pic:cNvPr id="0" name="w1_1.png"/>
+                    <pic:cNvPicPr/>
+                  </pic:nvPicPr>
+                  <pic:blipFill>
+                    <a:blip r:embed="rId11"/>
+                    <a:stretch>
+                      <a:fillRect/>
+                    </a:stretch>
+                  </pic:blipFill>
+                  <pic:spPr>
+                    <a:xfrm>
+                      <a:off x="0" y="0"/>
+                      <a:ext cx="4680000" cy="3120000"/>
+                    </a:xfrm>
+                    <a:prstGeom prst="rect"/>
+                  </pic:spPr>
+                </pic:pic>
+              </a:graphicData>
+            </a:graphic>
+          </wp:inline>
+        </w:drawing>
+      </w:r>
+    </w:p>
+    <w:p>
+      <w:pPr>
+        <w:jc w:val="center"/>
+      </w:pPr>
+      <w:r>
+        <w:rPr>
+          <w:i/>
+          <w:color w:val="555555"/>
+          <w:sz w:val="18"/>
+        </w:rPr>
+        <w:t>Picture 1. The teacher shows familiar tools people use every day: a spoon, a cup, a broom, a radio and a small phone. Technology means tools people make to help them work.</w:t>
+      </w:r>
+    </w:p>
+    <w:p>
+      <w:pPr>
+        <w:jc w:val="center"/>
+      </w:pPr>
+      <w:r>
+        <w:drawing>
+          <wp:inline xmlns:a="http://schemas.openxmlformats.org/drawingml/2006/main" xmlns:pic="http://schemas.openxmlformats.org/drawingml/2006/picture">
+            <wp:extent cx="4680000" cy="3120000" descr="A row of six outline boxes, each holding one object: a spoon, a cup, a broom, a bucket, a radio and a mobile phone."/>
+            <wp:docPr id="2" name="Picture 2"/>
+            <wp:cNvGraphicFramePr>
+              <a:graphicFrameLocks noChangeAspect="1"/>
+            </wp:cNvGraphicFramePr>
+            <a:graphic>
+              <a:graphicData uri="http://schemas.openxmlformats.org/drawingml/2006/picture">
+                <pic:pic>
+                  <pic:nvPicPr>
+                    <pic:cNvPr id="0" name="w1_2.png"/>
+                    <pic:cNvPicPr/>
+                  </pic:nvPicPr>
+                  <pic:blipFill>
+                    <a:blip r:embed="rId12"/>
+                    <a:stretch>
+                      <a:fillRect/>
+                    </a:stretch>
+                  </pic:blipFill>
+                  <pic:spPr>
+                    <a:xfrm>
+                      <a:off x="0" y="0"/>
+                      <a:ext cx="4680000" cy="3120000"/>
+                    </a:xfrm>
+                    <a:prstGeom prst="rect"/>
+                  </pic:spPr>
+                </pic:pic>
+              </a:graphicData>
+            </a:graphic>
+          </wp:inline>
+        </w:drawing>
+      </w:r>
+    </w:p>
+    <w:p>
+      <w:pPr>
+        <w:jc w:val="center"/>
+      </w:pPr>
+      <w:r>
+        <w:rPr>
+          <w:i/>
+          <w:color w:val="555555"/>
+          <w:sz w:val="18"/>
+        </w:rPr>
+        <w:t>Picture 2. Six everyday tools in order: spoon, cup, broom, bucket, radio and phone. Each object sits in its own box so learners can point and name them one by one.</w:t>
+      </w:r>
+    </w:p>
+    <w:p>
+      <w:pPr>
+        <w:jc w:val="center"/>
+      </w:pPr>
+      <w:r>
+        <w:drawing>
+          <wp:inline xmlns:a="http://schemas.openxmlformats.org/drawingml/2006/main" xmlns:pic="http://schemas.openxmlformats.org/drawingml/2006/picture">
+            <wp:extent cx="4680000" cy="3120000" descr="A girl places a cup into one basket while a boy watches; a second basket holds a broom, a bucket and a small radio."/>
+            <wp:docPr id="3" name="Picture 3"/>
+            <wp:cNvGraphicFramePr>
+              <a:graphicFrameLocks noChangeAspect="1"/>
+            </wp:cNvGraphicFramePr>
+            <a:graphic>
+              <a:graphicData uri="http://schemas.openxmlformats.org/drawingml/2006/picture">
+                <pic:pic>
+                  <pic:nvPicPr>
+                    <pic:cNvPr id="0" name="w1_3.png"/>
+                    <pic:cNvPicPr/>
+                  </pic:nvPicPr>
+                  <pic:blipFill>
+                    <a:blip r:embed="rId13"/>
+                    <a:stretch>
+                      <a:fillRect/>
+                    </a:stretch>
+                  </pic:blipFill>
+                  <pic:spPr>
+                    <a:xfrm>
+                      <a:off x="0" y="0"/>
+                      <a:ext cx="4680000" cy="3120000"/>
+                    </a:xfrm>
+                    <a:prstGeom prst="rect"/>
+                  </pic:spPr>
+                </pic:pic>
+              </a:graphicData>
+            </a:graphic>
+          </wp:inline>
+        </w:drawing>
+      </w:r>
+    </w:p>
+    <w:p>
+      <w:pPr>
+        <w:jc w:val="center"/>
+      </w:pPr>
+      <w:r>
+        <w:rPr>
+          <w:i/>
+          <w:color w:val="555555"/>
+          <w:sz w:val="18"/>
+        </w:rPr>
+        <w:t>Picture 3. Two pupils sort objects into two baskets by what each tool is used for. One basket holds things we eat with, the other holds things we clean and listen with.</w:t>
+      </w:r>
+    </w:p>
+    <w:p>
+      <w:pPr>
+        <w:jc w:val="center"/>
+      </w:pPr>
+      <w:r>
+        <w:drawing>
+          <wp:inline xmlns:a="http://schemas.openxmlformats.org/drawingml/2006/main" xmlns:pic="http://schemas.openxmlformats.org/drawingml/2006/picture">
+            <wp:extent cx="4680000" cy="3120000" descr="A young girl in school uniform smiles while drawing a picture of a mobile phone in her exercise book with a pencil."/>
+            <wp:docPr id="4" name="Picture 4"/>
+            <wp:cNvGraphicFramePr>
+              <a:graphicFrameLocks noChangeAspect="1"/>
+            </wp:cNvGraphicFramePr>
+            <a:graphic>
+              <a:graphicData uri="http://schemas.openxmlformats.org/drawingml/2006/picture">
+                <pic:pic>
+                  <pic:nvPicPr>
+                    <pic:cNvPr id="0" name="w1_4.png"/>
+                    <pic:cNvPicPr/>
+                  </pic:nvPicPr>
+                  <pic:blipFill>
+                    <a:blip r:embed="rId14"/>
+                    <a:stretch>
+                      <a:fillRect/>
+                    </a:stretch>
+                  </pic:blipFill>
+                  <pic:spPr>
+                    <a:xfrm>
+                      <a:off x="0" y="0"/>
+                      <a:ext cx="4680000" cy="3120000"/>
+                    </a:xfrm>
+                    <a:prstGeom prst="rect"/>
+                  </pic:spPr>
+                </pic:pic>
+              </a:graphicData>
+            </a:graphic>
+          </wp:inline>
+        </w:drawing>
+      </w:r>
+    </w:p>
+    <w:p>
+      <w:pPr>
+        <w:jc w:val="center"/>
+      </w:pPr>
+      <w:r>
+        <w:rPr>
+          <w:i/>
+          <w:color w:val="555555"/>
+          <w:sz w:val="18"/>
+        </w:rPr>
+        <w:t>Picture 4. A learner draws her favourite everyday tool in her exercise book. Drawing and naming a tool is a simple home activity with no device needed.</w:t>
+      </w:r>
+    </w:p>
+    <w:p>
+      <w:pPr>
+        <w:pStyle w:val="Heading1"/>
+      </w:pPr>
+      <w:r>
+        <w:t>6. Period One: Introduce and Model</w:t>
       </w:r>
     </w:p>
     <w:p>
@@ -1004,7 +1232,7 @@
         <w:pStyle w:val="Heading1"/>
       </w:pPr>
       <w:r>
-        <w:t>6. Period Two: Practise and Apply</w:t>
+        <w:t>7. Period Two: Practise and Apply</w:t>
       </w:r>
     </w:p>
     <w:p>
@@ -1036,7 +1264,7 @@
         <w:pStyle w:val="Heading1"/>
       </w:pPr>
       <w:r>
-        <w:t>7. Assessment and Evidence</w:t>
+        <w:t>8. Assessment and Evidence</w:t>
       </w:r>
     </w:p>
     <w:p>
@@ -1064,7 +1292,7 @@
         <w:pStyle w:val="Heading1"/>
       </w:pPr>
       <w:r>
-        <w:t>8. Suggested Questions and Answer Guidance</w:t>
+        <w:t>9. Suggested Questions and Answer Guidance</w:t>
       </w:r>
     </w:p>
     <w:p>
@@ -1099,7 +1327,7 @@
         <w:pStyle w:val="Heading1"/>
       </w:pPr>
       <w:r>
-        <w:t>9. Home Activity</w:t>
+        <w:t>10. Home Activity</w:t>
       </w:r>
     </w:p>
     <w:p>
@@ -1119,7 +1347,7 @@
         <w:pStyle w:val="Heading1"/>
       </w:pPr>
       <w:r>
-        <w:t>10. Inclusion</w:t>
+        <w:t>11. Inclusion</w:t>
       </w:r>
     </w:p>
     <w:p>
@@ -1139,7 +1367,7 @@
         <w:pStyle w:val="Heading1"/>
       </w:pPr>
       <w:r>
-        <w:t>11. Safety and Privacy</w:t>
+        <w:t>12. Safety and Privacy</w:t>
       </w:r>
     </w:p>
     <w:p>
@@ -1159,7 +1387,7 @@
         <w:pStyle w:val="Heading1"/>
       </w:pPr>
       <w:r>
-        <w:t>12. Teacher Reflection</w:t>
+        <w:t>13. Teacher Reflection</w:t>
       </w:r>
     </w:p>
     <w:p>
@@ -1197,7 +1425,7 @@
         <w:pStyle w:val="Heading1"/>
       </w:pPr>
       <w:r>
-        <w:t>13. Curriculum Alignment and Document Status</w:t>
+        <w:t>14. Curriculum Alignment and Document Status</w:t>
       </w:r>
     </w:p>
     <w:tbl>

</xml_diff>

<commit_message>
Publish Week 1 lesson video (Nigerian female voice) with Watch link + QR in note
</commit_message>
<xml_diff>
--- a/downloads/Rehoteq_Lesson_Note_P1_T1_W1_Getting_to_Know_Technology.docx
+++ b/downloads/Rehoteq_Lesson_Note_P1_T1_W1_Getting_to_Know_Technology.docx
@@ -1425,7 +1425,79 @@
         <w:pStyle w:val="Heading1"/>
       </w:pPr>
       <w:r>
-        <w:t>14. Curriculum Alignment and Document Status</w:t>
+        <w:t>14. Watch the Lesson Video</w:t>
+      </w:r>
+    </w:p>
+    <w:p>
+      <w:pPr>
+        <w:spacing w:after="120"/>
+      </w:pPr>
+      <w:r>
+        <w:rPr>
+          <w:b w:val="0"/>
+          <w:i w:val="0"/>
+        </w:rPr>
+        <w:t>This week comes with a one-minute lesson video, narrated by a Nigerian female voice. Pupils can watch it on any phone with internet. Scan the code below with a phone camera, or visit rehoteq.com and open the Primary 1 lesson note library.</w:t>
+      </w:r>
+    </w:p>
+    <w:p>
+      <w:pPr>
+        <w:jc w:val="center"/>
+      </w:pPr>
+      <w:r>
+        <w:drawing>
+          <wp:inline xmlns:a="http://schemas.openxmlformats.org/drawingml/2006/main" xmlns:pic="http://schemas.openxmlformats.org/drawingml/2006/picture">
+            <wp:extent cx="4680000" cy="4680000" descr="A square QR code that links to the Week 1 lesson video on rehoteq.com."/>
+            <wp:docPr id="5" name="Picture 5"/>
+            <wp:cNvGraphicFramePr>
+              <a:graphicFrameLocks noChangeAspect="1"/>
+            </wp:cNvGraphicFramePr>
+            <a:graphic>
+              <a:graphicData uri="http://schemas.openxmlformats.org/drawingml/2006/picture">
+                <pic:pic>
+                  <pic:nvPicPr>
+                    <pic:cNvPr id="0" name="w1_watch_qr.png"/>
+                    <pic:cNvPicPr/>
+                  </pic:nvPicPr>
+                  <pic:blipFill>
+                    <a:blip r:embed="rId15"/>
+                    <a:stretch>
+                      <a:fillRect/>
+                    </a:stretch>
+                  </pic:blipFill>
+                  <pic:spPr>
+                    <a:xfrm>
+                      <a:off x="0" y="0"/>
+                      <a:ext cx="4680000" cy="4680000"/>
+                    </a:xfrm>
+                    <a:prstGeom prst="rect"/>
+                  </pic:spPr>
+                </pic:pic>
+              </a:graphicData>
+            </a:graphic>
+          </wp:inline>
+        </w:drawing>
+      </w:r>
+    </w:p>
+    <w:p>
+      <w:pPr>
+        <w:jc w:val="center"/>
+      </w:pPr>
+      <w:r>
+        <w:rPr>
+          <w:i/>
+          <w:color w:val="555555"/>
+          <w:sz w:val="18"/>
+        </w:rPr>
+        <w:t>Scan this QR code with a phone camera to watch the Week 1 lesson video on rehoteq.com.</w:t>
+      </w:r>
+    </w:p>
+    <w:p>
+      <w:pPr>
+        <w:pStyle w:val="Heading1"/>
+      </w:pPr>
+      <w:r>
+        <w:t>15. Curriculum Alignment and Document Status</w:t>
       </w:r>
     </w:p>
     <w:tbl>

</xml_diff>